<commit_message>
feat(documents): add RRF and letterhead templates with online modules
Ship Excel templates (RRF + Manuco/Quarryco entêtes), Documents hub cards, export Excel/PDF via template layout, and single-line RRF history.

Co-authored-by: Cursor <cursoragent@cursor.com>
</commit_message>
<xml_diff>
--- a/Excel/templates/exit/Attestation de fin de service.docx
+++ b/Excel/templates/exit/Attestation de fin de service.docx
@@ -1,6 +1,6 @@
 
 <file path=word/document.xml><?xml version="1.0" encoding="utf-8"?>
-<w:document xmlns:wpc="http://schemas.microsoft.com/office/word/2010/wordprocessingCanvas" xmlns:cx="http://schemas.microsoft.com/office/drawing/2014/chartex" xmlns:cx1="http://schemas.microsoft.com/office/drawing/2015/9/8/chartex" xmlns:cx2="http://schemas.microsoft.com/office/drawing/2015/10/21/chartex" xmlns:cx3="http://schemas.microsoft.com/office/drawing/2016/5/9/chartex" xmlns:cx4="http://schemas.microsoft.com/office/drawing/2016/5/10/chartex" xmlns:cx5="http://schemas.microsoft.com/office/drawing/2016/5/11/chartex" xmlns:cx6="http://schemas.microsoft.com/office/drawing/2016/5/12/chartex" xmlns:cx7="http://schemas.microsoft.com/office/drawing/2016/5/13/chartex" xmlns:cx8="http://schemas.microsoft.com/office/drawing/2016/5/14/chartex" xmlns:mc="http://schemas.openxmlformats.org/markup-compatibility/2006" xmlns:aink="http://schemas.microsoft.com/office/drawing/2016/ink" xmlns:am3d="http://schemas.microsoft.com/office/drawing/2017/model3d" xmlns:o="urn:schemas-microsoft-com:office:office" xmlns:oel="http://schemas.microsoft.com/office/2019/extlst" xmlns:r="http://schemas.openxmlformats.org/officeDocument/2006/relationships" xmlns:m="http://schemas.openxmlformats.org/officeDocument/2006/math" xmlns:v="urn:schemas-microsoft-com:vml" xmlns:wp14="http://schemas.microsoft.com/office/word/2010/wordprocessingDrawing" xmlns:wp="http://schemas.openxmlformats.org/drawingml/2006/wordprocessingDrawing" xmlns:w10="urn:schemas-microsoft-com:office:word" xmlns:w="http://schemas.openxmlformats.org/wordprocessingml/2006/main" xmlns:w14="http://schemas.microsoft.com/office/word/2010/wordml" xmlns:w15="http://schemas.microsoft.com/office/word/2012/wordml" xmlns:w16cex="http://schemas.microsoft.com/office/word/2018/wordml/cex" xmlns:w16cid="http://schemas.microsoft.com/office/word/2016/wordml/cid" xmlns:w16="http://schemas.microsoft.com/office/word/2018/wordml" xmlns:w16du="http://schemas.microsoft.com/office/word/2023/wordml/word16du" xmlns:w16sdtdh="http://schemas.microsoft.com/office/word/2020/wordml/sdtdatahash" xmlns:w16sdtfl="http://schemas.microsoft.com/office/word/2024/wordml/sdtformatlock" xmlns:w16se="http://schemas.microsoft.com/office/word/2015/wordml/symex" xmlns:wpg="http://schemas.microsoft.com/office/word/2010/wordprocessingGroup" xmlns:wpi="http://schemas.microsoft.com/office/word/2010/wordprocessingInk" xmlns:wne="http://schemas.microsoft.com/office/word/2006/wordml" xmlns:wps="http://schemas.microsoft.com/office/word/2010/wordprocessingShape" mc:Ignorable="w14 w15 w16se w16cid w16 w16cex w16sdtdh w16sdtfl w16du wp14">
+<w:document xmlns:wpc="http://schemas.microsoft.com/office/word/2010/wordprocessingCanvas" xmlns:cx="http://schemas.microsoft.com/office/drawing/2014/chartex" xmlns:cx1="http://schemas.microsoft.com/office/drawing/2015/9/8/chartex" xmlns:cx2="http://schemas.microsoft.com/office/drawing/2015/10/21/chartex" xmlns:cx3="http://schemas.microsoft.com/office/drawing/2016/5/9/chartex" xmlns:cx4="http://schemas.microsoft.com/office/drawing/2016/5/10/chartex" xmlns:cx5="http://schemas.microsoft.com/office/drawing/2016/5/11/chartex" xmlns:cx6="http://schemas.microsoft.com/office/drawing/2016/5/12/chartex" xmlns:cx7="http://schemas.microsoft.com/office/drawing/2016/5/13/chartex" xmlns:cx8="http://schemas.microsoft.com/office/drawing/2016/5/14/chartex" xmlns:mc="http://schemas.openxmlformats.org/markup-compatibility/2006" xmlns:aink="http://schemas.microsoft.com/office/drawing/2016/ink" xmlns:am3d="http://schemas.microsoft.com/office/drawing/2017/model3d" xmlns:o="urn:schemas-microsoft-com:office:office" xmlns:oel="http://schemas.microsoft.com/office/2019/extlst" xmlns:r="http://schemas.openxmlformats.org/officeDocument/2006/relationships" xmlns:m="http://schemas.openxmlformats.org/officeDocument/2006/math" xmlns:v="urn:schemas-microsoft-com:vml" xmlns:wp14="http://schemas.microsoft.com/office/word/2010/wordprocessingDrawing" xmlns:wp="http://schemas.openxmlformats.org/drawingml/2006/wordprocessingDrawing" xmlns:w10="urn:schemas-microsoft-com:office:word" xmlns:w="http://schemas.openxmlformats.org/wordprocessingml/2006/main" xmlns:w14="http://schemas.microsoft.com/office/word/2010/wordml" xmlns:w15="http://schemas.microsoft.com/office/word/2012/wordml" xmlns:w16cei="http://schemas.microsoft.com/office/word/2026/wordml/cei" xmlns:w16cex="http://schemas.microsoft.com/office/word/2018/wordml/cex" xmlns:w16cid="http://schemas.microsoft.com/office/word/2016/wordml/cid" xmlns:w16="http://schemas.microsoft.com/office/word/2018/wordml" xmlns:w16du="http://schemas.microsoft.com/office/word/2023/wordml/word16du" xmlns:w16sdtdh="http://schemas.microsoft.com/office/word/2020/wordml/sdtdatahash" xmlns:w16sdtfl="http://schemas.microsoft.com/office/word/2024/wordml/sdtformatlock" xmlns:w16se="http://schemas.microsoft.com/office/word/2015/wordml/symex" xmlns:wpg="http://schemas.microsoft.com/office/word/2010/wordprocessingGroup" xmlns:wpi="http://schemas.microsoft.com/office/word/2010/wordprocessingInk" xmlns:wne="http://schemas.microsoft.com/office/word/2006/wordml" xmlns:wps="http://schemas.microsoft.com/office/word/2010/wordprocessingShape" mc:Ignorable="w14 w15 w16se w16cid w16 w16cex w16sdtdh w16sdtfl w16du wp14">
   <w:body>
     <w:p>
       <w:pPr>
@@ -173,7 +173,29 @@
           <w:szCs w:val="26"/>
           <w:lang w:val="fr-FR" w:eastAsia="en-ZA"/>
         </w:rPr>
-        <w:t xml:space="preserve">, Directrice des Ressources Humaines de PPC Barnet DRC Manufacturing SA, atteste par le présent que Monsieur </w:t>
+        <w:t xml:space="preserve">, Directrice des Ressources Humaines de PPC Barnet DRC </w:t>
+      </w:r>
+      <w:proofErr w:type="spellStart"/>
+      <w:r>
+        <w:rPr>
+          <w:rFonts w:ascii="Times New Roman" w:hAnsi="Times New Roman" w:cs="Times New Roman"/>
+          <w:color w:val="000000" w:themeColor="text1"/>
+          <w:sz w:val="26"/>
+          <w:szCs w:val="26"/>
+          <w:lang w:val="fr-FR" w:eastAsia="en-ZA"/>
+        </w:rPr>
+        <w:t>Manufacturing</w:t>
+      </w:r>
+      <w:proofErr w:type="spellEnd"/>
+      <w:r>
+        <w:rPr>
+          <w:rFonts w:ascii="Times New Roman" w:hAnsi="Times New Roman" w:cs="Times New Roman"/>
+          <w:color w:val="000000" w:themeColor="text1"/>
+          <w:sz w:val="26"/>
+          <w:szCs w:val="26"/>
+          <w:lang w:val="fr-FR" w:eastAsia="en-ZA"/>
+        </w:rPr>
+        <w:t xml:space="preserve"> SA, atteste par le présent que Monsieur </w:t>
       </w:r>
       <w:r>
         <w:rPr>
@@ -245,6 +267,7 @@
         </w:rPr>
         <w:t xml:space="preserve">CNSS sous le numéro </w:t>
       </w:r>
+      <w:proofErr w:type="gramStart"/>
       <w:r>
         <w:rPr>
           <w:rFonts w:ascii="Times New Roman" w:hAnsi="Times New Roman" w:cs="Times New Roman"/>
@@ -289,7 +312,18 @@
           <w:szCs w:val="26"/>
           <w:lang w:val="fr-FR" w:eastAsia="en-ZA"/>
         </w:rPr>
-        <w:t xml:space="preserve">, a été à notre service du </w:t>
+        <w:t>,</w:t>
+      </w:r>
+      <w:proofErr w:type="gramEnd"/>
+      <w:r>
+        <w:rPr>
+          <w:rFonts w:ascii="Times New Roman" w:hAnsi="Times New Roman" w:cs="Times New Roman"/>
+          <w:color w:val="000000" w:themeColor="text1"/>
+          <w:sz w:val="26"/>
+          <w:szCs w:val="26"/>
+          <w:lang w:val="fr-FR" w:eastAsia="en-ZA"/>
+        </w:rPr>
+        <w:t xml:space="preserve"> a été à notre service du </w:t>
       </w:r>
       <w:r>
         <w:rPr>
@@ -720,12 +754,8 @@
       </w:r>
     </w:p>
     <w:sectPr>
-      <w:headerReference w:type="even" r:id="rId7"/>
-      <w:headerReference w:type="default" r:id="rId8"/>
-      <w:footerReference w:type="even" r:id="rId9"/>
-      <w:footerReference w:type="default" r:id="rId10"/>
-      <w:headerReference w:type="first" r:id="rId11"/>
-      <w:footerReference w:type="first" r:id="rId12"/>
+      <w:headerReference w:type="default" r:id="rId7"/>
+      <w:footerReference w:type="default" r:id="rId8"/>
       <w:pgSz w:w="11906" w:h="16838"/>
       <w:pgMar w:top="1890" w:right="1106" w:bottom="630" w:left="1080" w:header="720" w:footer="546" w:gutter="0"/>
       <w:cols w:space="720"/>
@@ -735,7 +765,7 @@
 </file>
 
 <file path=word/endnotes.xml><?xml version="1.0" encoding="utf-8"?>
-<w:endnotes xmlns:wpc="http://schemas.microsoft.com/office/word/2010/wordprocessingCanvas" xmlns:cx="http://schemas.microsoft.com/office/drawing/2014/chartex" xmlns:cx1="http://schemas.microsoft.com/office/drawing/2015/9/8/chartex" xmlns:cx2="http://schemas.microsoft.com/office/drawing/2015/10/21/chartex" xmlns:cx3="http://schemas.microsoft.com/office/drawing/2016/5/9/chartex" xmlns:cx4="http://schemas.microsoft.com/office/drawing/2016/5/10/chartex" xmlns:cx5="http://schemas.microsoft.com/office/drawing/2016/5/11/chartex" xmlns:cx6="http://schemas.microsoft.com/office/drawing/2016/5/12/chartex" xmlns:cx7="http://schemas.microsoft.com/office/drawing/2016/5/13/chartex" xmlns:cx8="http://schemas.microsoft.com/office/drawing/2016/5/14/chartex" xmlns:mc="http://schemas.openxmlformats.org/markup-compatibility/2006" xmlns:aink="http://schemas.microsoft.com/office/drawing/2016/ink" xmlns:am3d="http://schemas.microsoft.com/office/drawing/2017/model3d" xmlns:o="urn:schemas-microsoft-com:office:office" xmlns:oel="http://schemas.microsoft.com/office/2019/extlst" xmlns:r="http://schemas.openxmlformats.org/officeDocument/2006/relationships" xmlns:m="http://schemas.openxmlformats.org/officeDocument/2006/math" xmlns:v="urn:schemas-microsoft-com:vml" xmlns:wp14="http://schemas.microsoft.com/office/word/2010/wordprocessingDrawing" xmlns:wp="http://schemas.openxmlformats.org/drawingml/2006/wordprocessingDrawing" xmlns:w10="urn:schemas-microsoft-com:office:word" xmlns:w="http://schemas.openxmlformats.org/wordprocessingml/2006/main" xmlns:w14="http://schemas.microsoft.com/office/word/2010/wordml" xmlns:w15="http://schemas.microsoft.com/office/word/2012/wordml" xmlns:w16cex="http://schemas.microsoft.com/office/word/2018/wordml/cex" xmlns:w16cid="http://schemas.microsoft.com/office/word/2016/wordml/cid" xmlns:w16="http://schemas.microsoft.com/office/word/2018/wordml" xmlns:w16du="http://schemas.microsoft.com/office/word/2023/wordml/word16du" xmlns:w16sdtdh="http://schemas.microsoft.com/office/word/2020/wordml/sdtdatahash" xmlns:w16sdtfl="http://schemas.microsoft.com/office/word/2024/wordml/sdtformatlock" xmlns:w16se="http://schemas.microsoft.com/office/word/2015/wordml/symex" xmlns:wpg="http://schemas.microsoft.com/office/word/2010/wordprocessingGroup" xmlns:wpi="http://schemas.microsoft.com/office/word/2010/wordprocessingInk" xmlns:wne="http://schemas.microsoft.com/office/word/2006/wordml" xmlns:wps="http://schemas.microsoft.com/office/word/2010/wordprocessingShape" mc:Ignorable="w14 w15 w16se w16cid w16 w16cex w16sdtdh w16sdtfl w16du wp14">
+<w:endnotes xmlns:wpc="http://schemas.microsoft.com/office/word/2010/wordprocessingCanvas" xmlns:cx="http://schemas.microsoft.com/office/drawing/2014/chartex" xmlns:cx1="http://schemas.microsoft.com/office/drawing/2015/9/8/chartex" xmlns:cx2="http://schemas.microsoft.com/office/drawing/2015/10/21/chartex" xmlns:cx3="http://schemas.microsoft.com/office/drawing/2016/5/9/chartex" xmlns:cx4="http://schemas.microsoft.com/office/drawing/2016/5/10/chartex" xmlns:cx5="http://schemas.microsoft.com/office/drawing/2016/5/11/chartex" xmlns:cx6="http://schemas.microsoft.com/office/drawing/2016/5/12/chartex" xmlns:cx7="http://schemas.microsoft.com/office/drawing/2016/5/13/chartex" xmlns:cx8="http://schemas.microsoft.com/office/drawing/2016/5/14/chartex" xmlns:mc="http://schemas.openxmlformats.org/markup-compatibility/2006" xmlns:aink="http://schemas.microsoft.com/office/drawing/2016/ink" xmlns:am3d="http://schemas.microsoft.com/office/drawing/2017/model3d" xmlns:o="urn:schemas-microsoft-com:office:office" xmlns:oel="http://schemas.microsoft.com/office/2019/extlst" xmlns:r="http://schemas.openxmlformats.org/officeDocument/2006/relationships" xmlns:m="http://schemas.openxmlformats.org/officeDocument/2006/math" xmlns:v="urn:schemas-microsoft-com:vml" xmlns:wp14="http://schemas.microsoft.com/office/word/2010/wordprocessingDrawing" xmlns:wp="http://schemas.openxmlformats.org/drawingml/2006/wordprocessingDrawing" xmlns:w10="urn:schemas-microsoft-com:office:word" xmlns:w="http://schemas.openxmlformats.org/wordprocessingml/2006/main" xmlns:w14="http://schemas.microsoft.com/office/word/2010/wordml" xmlns:w15="http://schemas.microsoft.com/office/word/2012/wordml" xmlns:w16cei="http://schemas.microsoft.com/office/word/2026/wordml/cei" xmlns:w16cex="http://schemas.microsoft.com/office/word/2018/wordml/cex" xmlns:w16cid="http://schemas.microsoft.com/office/word/2016/wordml/cid" xmlns:w16="http://schemas.microsoft.com/office/word/2018/wordml" xmlns:w16du="http://schemas.microsoft.com/office/word/2023/wordml/word16du" xmlns:w16sdtdh="http://schemas.microsoft.com/office/word/2020/wordml/sdtdatahash" xmlns:w16sdtfl="http://schemas.microsoft.com/office/word/2024/wordml/sdtformatlock" xmlns:w16se="http://schemas.microsoft.com/office/word/2015/wordml/symex" xmlns:wpg="http://schemas.microsoft.com/office/word/2010/wordprocessingGroup" xmlns:wpi="http://schemas.microsoft.com/office/word/2010/wordprocessingInk" xmlns:wne="http://schemas.microsoft.com/office/word/2006/wordml" xmlns:wps="http://schemas.microsoft.com/office/word/2010/wordprocessingShape" mc:Ignorable="w14 w15 w16se w16cid w16 w16cex w16sdtdh w16sdtfl w16du wp14">
   <w:endnote w:type="separator" w:id="-1">
     <w:p>
       <w:pPr>
@@ -760,17 +790,7 @@
 </file>
 
 <file path=word/footer1.xml><?xml version="1.0" encoding="utf-8"?>
-<w:ftr xmlns:wpc="http://schemas.microsoft.com/office/word/2010/wordprocessingCanvas" xmlns:cx="http://schemas.microsoft.com/office/drawing/2014/chartex" xmlns:cx1="http://schemas.microsoft.com/office/drawing/2015/9/8/chartex" xmlns:cx2="http://schemas.microsoft.com/office/drawing/2015/10/21/chartex" xmlns:cx3="http://schemas.microsoft.com/office/drawing/2016/5/9/chartex" xmlns:cx4="http://schemas.microsoft.com/office/drawing/2016/5/10/chartex" xmlns:cx5="http://schemas.microsoft.com/office/drawing/2016/5/11/chartex" xmlns:cx6="http://schemas.microsoft.com/office/drawing/2016/5/12/chartex" xmlns:cx7="http://schemas.microsoft.com/office/drawing/2016/5/13/chartex" xmlns:cx8="http://schemas.microsoft.com/office/drawing/2016/5/14/chartex" xmlns:mc="http://schemas.openxmlformats.org/markup-compatibility/2006" xmlns:aink="http://schemas.microsoft.com/office/drawing/2016/ink" xmlns:am3d="http://schemas.microsoft.com/office/drawing/2017/model3d" xmlns:o="urn:schemas-microsoft-com:office:office" xmlns:oel="http://schemas.microsoft.com/office/2019/extlst" xmlns:r="http://schemas.openxmlformats.org/officeDocument/2006/relationships" xmlns:m="http://schemas.openxmlformats.org/officeDocument/2006/math" xmlns:v="urn:schemas-microsoft-com:vml" xmlns:wp14="http://schemas.microsoft.com/office/word/2010/wordprocessingDrawing" xmlns:wp="http://schemas.openxmlformats.org/drawingml/2006/wordprocessingDrawing" xmlns:w10="urn:schemas-microsoft-com:office:word" xmlns:w="http://schemas.openxmlformats.org/wordprocessingml/2006/main" xmlns:w14="http://schemas.microsoft.com/office/word/2010/wordml" xmlns:w15="http://schemas.microsoft.com/office/word/2012/wordml" xmlns:w16cex="http://schemas.microsoft.com/office/word/2018/wordml/cex" xmlns:w16cid="http://schemas.microsoft.com/office/word/2016/wordml/cid" xmlns:w16="http://schemas.microsoft.com/office/word/2018/wordml" xmlns:w16du="http://schemas.microsoft.com/office/word/2023/wordml/word16du" xmlns:w16sdtdh="http://schemas.microsoft.com/office/word/2020/wordml/sdtdatahash" xmlns:w16sdtfl="http://schemas.microsoft.com/office/word/2024/wordml/sdtformatlock" xmlns:w16se="http://schemas.microsoft.com/office/word/2015/wordml/symex" xmlns:wpg="http://schemas.microsoft.com/office/word/2010/wordprocessingGroup" xmlns:wpi="http://schemas.microsoft.com/office/word/2010/wordprocessingInk" xmlns:wne="http://schemas.microsoft.com/office/word/2006/wordml" xmlns:wps="http://schemas.microsoft.com/office/word/2010/wordprocessingShape" mc:Ignorable="w14 w15 w16se w16cid w16 w16cex w16sdtdh w16sdtfl w16du wp14">
-  <w:p>
-    <w:pPr>
-      <w:pStyle w:val="Footer"/>
-    </w:pPr>
-  </w:p>
-</w:ftr>
-</file>
-
-<file path=word/footer2.xml><?xml version="1.0" encoding="utf-8"?>
-<w:ftr xmlns:wpc="http://schemas.microsoft.com/office/word/2010/wordprocessingCanvas" xmlns:cx="http://schemas.microsoft.com/office/drawing/2014/chartex" xmlns:cx1="http://schemas.microsoft.com/office/drawing/2015/9/8/chartex" xmlns:cx2="http://schemas.microsoft.com/office/drawing/2015/10/21/chartex" xmlns:cx3="http://schemas.microsoft.com/office/drawing/2016/5/9/chartex" xmlns:cx4="http://schemas.microsoft.com/office/drawing/2016/5/10/chartex" xmlns:cx5="http://schemas.microsoft.com/office/drawing/2016/5/11/chartex" xmlns:cx6="http://schemas.microsoft.com/office/drawing/2016/5/12/chartex" xmlns:cx7="http://schemas.microsoft.com/office/drawing/2016/5/13/chartex" xmlns:cx8="http://schemas.microsoft.com/office/drawing/2016/5/14/chartex" xmlns:mc="http://schemas.openxmlformats.org/markup-compatibility/2006" xmlns:aink="http://schemas.microsoft.com/office/drawing/2016/ink" xmlns:am3d="http://schemas.microsoft.com/office/drawing/2017/model3d" xmlns:o="urn:schemas-microsoft-com:office:office" xmlns:oel="http://schemas.microsoft.com/office/2019/extlst" xmlns:r="http://schemas.openxmlformats.org/officeDocument/2006/relationships" xmlns:m="http://schemas.openxmlformats.org/officeDocument/2006/math" xmlns:v="urn:schemas-microsoft-com:vml" xmlns:wp14="http://schemas.microsoft.com/office/word/2010/wordprocessingDrawing" xmlns:wp="http://schemas.openxmlformats.org/drawingml/2006/wordprocessingDrawing" xmlns:w10="urn:schemas-microsoft-com:office:word" xmlns:w="http://schemas.openxmlformats.org/wordprocessingml/2006/main" xmlns:w14="http://schemas.microsoft.com/office/word/2010/wordml" xmlns:w15="http://schemas.microsoft.com/office/word/2012/wordml" xmlns:w16cex="http://schemas.microsoft.com/office/word/2018/wordml/cex" xmlns:w16cid="http://schemas.microsoft.com/office/word/2016/wordml/cid" xmlns:w16="http://schemas.microsoft.com/office/word/2018/wordml" xmlns:w16du="http://schemas.microsoft.com/office/word/2023/wordml/word16du" xmlns:w16sdtdh="http://schemas.microsoft.com/office/word/2020/wordml/sdtdatahash" xmlns:w16sdtfl="http://schemas.microsoft.com/office/word/2024/wordml/sdtformatlock" xmlns:w16se="http://schemas.microsoft.com/office/word/2015/wordml/symex" xmlns:wpg="http://schemas.microsoft.com/office/word/2010/wordprocessingGroup" xmlns:wpi="http://schemas.microsoft.com/office/word/2010/wordprocessingInk" xmlns:wne="http://schemas.microsoft.com/office/word/2006/wordml" xmlns:wps="http://schemas.microsoft.com/office/word/2010/wordprocessingShape" mc:Ignorable="w14 w15 w16se w16cid w16 w16cex w16sdtdh w16sdtfl w16du wp14">
+<w:ftr xmlns:wpc="http://schemas.microsoft.com/office/word/2010/wordprocessingCanvas" xmlns:cx="http://schemas.microsoft.com/office/drawing/2014/chartex" xmlns:cx1="http://schemas.microsoft.com/office/drawing/2015/9/8/chartex" xmlns:cx2="http://schemas.microsoft.com/office/drawing/2015/10/21/chartex" xmlns:cx3="http://schemas.microsoft.com/office/drawing/2016/5/9/chartex" xmlns:cx4="http://schemas.microsoft.com/office/drawing/2016/5/10/chartex" xmlns:cx5="http://schemas.microsoft.com/office/drawing/2016/5/11/chartex" xmlns:cx6="http://schemas.microsoft.com/office/drawing/2016/5/12/chartex" xmlns:cx7="http://schemas.microsoft.com/office/drawing/2016/5/13/chartex" xmlns:cx8="http://schemas.microsoft.com/office/drawing/2016/5/14/chartex" xmlns:mc="http://schemas.openxmlformats.org/markup-compatibility/2006" xmlns:aink="http://schemas.microsoft.com/office/drawing/2016/ink" xmlns:am3d="http://schemas.microsoft.com/office/drawing/2017/model3d" xmlns:o="urn:schemas-microsoft-com:office:office" xmlns:oel="http://schemas.microsoft.com/office/2019/extlst" xmlns:r="http://schemas.openxmlformats.org/officeDocument/2006/relationships" xmlns:m="http://schemas.openxmlformats.org/officeDocument/2006/math" xmlns:v="urn:schemas-microsoft-com:vml" xmlns:wp14="http://schemas.microsoft.com/office/word/2010/wordprocessingDrawing" xmlns:wp="http://schemas.openxmlformats.org/drawingml/2006/wordprocessingDrawing" xmlns:w10="urn:schemas-microsoft-com:office:word" xmlns:w="http://schemas.openxmlformats.org/wordprocessingml/2006/main" xmlns:w14="http://schemas.microsoft.com/office/word/2010/wordml" xmlns:w15="http://schemas.microsoft.com/office/word/2012/wordml" xmlns:w16cei="http://schemas.microsoft.com/office/word/2026/wordml/cei" xmlns:w16cex="http://schemas.microsoft.com/office/word/2018/wordml/cex" xmlns:w16cid="http://schemas.microsoft.com/office/word/2016/wordml/cid" xmlns:w16="http://schemas.microsoft.com/office/word/2018/wordml" xmlns:w16du="http://schemas.microsoft.com/office/word/2023/wordml/word16du" xmlns:w16sdtdh="http://schemas.microsoft.com/office/word/2020/wordml/sdtdatahash" xmlns:w16sdtfl="http://schemas.microsoft.com/office/word/2024/wordml/sdtformatlock" xmlns:w16se="http://schemas.microsoft.com/office/word/2015/wordml/symex" xmlns:wpg="http://schemas.microsoft.com/office/word/2010/wordprocessingGroup" xmlns:wpi="http://schemas.microsoft.com/office/word/2010/wordprocessingInk" xmlns:wne="http://schemas.microsoft.com/office/word/2006/wordml" xmlns:wps="http://schemas.microsoft.com/office/word/2010/wordprocessingShape" mc:Ignorable="w14 w15 w16se w16cid w16 w16cex w16sdtdh w16sdtfl w16du wp14">
   <w:p>
     <w:pPr>
       <w:pStyle w:val="Footer"/>
@@ -867,7 +887,98 @@
                               <w:szCs w:val="14"/>
                               <w:lang w:val="fr-FR"/>
                             </w:rPr>
-                            <w:t xml:space="preserve">   P Kahasha (Directeur Général), S Lukamba, A Bamanisa, K Ross , K Mpinga(PCA)</w:t>
+                            <w:t xml:space="preserve">   P Kahasha (Directeur Général), S </w:t>
+                          </w:r>
+                          <w:proofErr w:type="spellStart"/>
+                          <w:r>
+                            <w:rPr>
+                              <w:rFonts w:ascii="Times New Roman" w:hAnsi="Times New Roman"/>
+                              <w:sz w:val="14"/>
+                              <w:szCs w:val="14"/>
+                              <w:lang w:val="fr-FR"/>
+                            </w:rPr>
+                            <w:t>Lukamba</w:t>
+                          </w:r>
+                          <w:proofErr w:type="spellEnd"/>
+                          <w:r>
+                            <w:rPr>
+                              <w:rFonts w:ascii="Times New Roman" w:hAnsi="Times New Roman"/>
+                              <w:sz w:val="14"/>
+                              <w:szCs w:val="14"/>
+                              <w:lang w:val="fr-FR"/>
+                            </w:rPr>
+                            <w:t xml:space="preserve">, A </w:t>
+                          </w:r>
+                          <w:proofErr w:type="spellStart"/>
+                          <w:r>
+                            <w:rPr>
+                              <w:rFonts w:ascii="Times New Roman" w:hAnsi="Times New Roman"/>
+                              <w:sz w:val="14"/>
+                              <w:szCs w:val="14"/>
+                              <w:lang w:val="fr-FR"/>
+                            </w:rPr>
+                            <w:t>Bamanisa</w:t>
+                          </w:r>
+                          <w:proofErr w:type="spellEnd"/>
+                          <w:r>
+                            <w:rPr>
+                              <w:rFonts w:ascii="Times New Roman" w:hAnsi="Times New Roman"/>
+                              <w:sz w:val="14"/>
+                              <w:szCs w:val="14"/>
+                              <w:lang w:val="fr-FR"/>
+                            </w:rPr>
+                            <w:t xml:space="preserve">, K </w:t>
+                          </w:r>
+                          <w:proofErr w:type="gramStart"/>
+                          <w:r>
+                            <w:rPr>
+                              <w:rFonts w:ascii="Times New Roman" w:hAnsi="Times New Roman"/>
+                              <w:sz w:val="14"/>
+                              <w:szCs w:val="14"/>
+                              <w:lang w:val="fr-FR"/>
+                            </w:rPr>
+                            <w:t>Ross ,</w:t>
+                          </w:r>
+                          <w:proofErr w:type="gramEnd"/>
+                          <w:r>
+                            <w:rPr>
+                              <w:rFonts w:ascii="Times New Roman" w:hAnsi="Times New Roman"/>
+                              <w:sz w:val="14"/>
+                              <w:szCs w:val="14"/>
+                              <w:lang w:val="fr-FR"/>
+                            </w:rPr>
+                            <w:t xml:space="preserve"> K </w:t>
+                          </w:r>
+                          <w:proofErr w:type="spellStart"/>
+                          <w:proofErr w:type="gramStart"/>
+                          <w:r>
+                            <w:rPr>
+                              <w:rFonts w:ascii="Times New Roman" w:hAnsi="Times New Roman"/>
+                              <w:sz w:val="14"/>
+                              <w:szCs w:val="14"/>
+                              <w:lang w:val="fr-FR"/>
+                            </w:rPr>
+                            <w:t>Mpinga</w:t>
+                          </w:r>
+                          <w:proofErr w:type="spellEnd"/>
+                          <w:r>
+                            <w:rPr>
+                              <w:rFonts w:ascii="Times New Roman" w:hAnsi="Times New Roman"/>
+                              <w:sz w:val="14"/>
+                              <w:szCs w:val="14"/>
+                              <w:lang w:val="fr-FR"/>
+                            </w:rPr>
+                            <w:t>(</w:t>
+                          </w:r>
+                          <w:proofErr w:type="gramEnd"/>
+                          <w:r>
+                            <w:rPr>
+                              <w:rFonts w:ascii="Times New Roman" w:hAnsi="Times New Roman"/>
+                              <w:sz w:val="14"/>
+                              <w:szCs w:val="14"/>
+                              <w:lang w:val="fr-FR"/>
+                            </w:rPr>
+                            <w:t>PCA)</w:t>
                           </w:r>
                         </w:p>
                         <w:p>
@@ -963,18 +1074,8 @@
 </w:ftr>
 </file>
 
-<file path=word/footer3.xml><?xml version="1.0" encoding="utf-8"?>
-<w:ftr xmlns:wpc="http://schemas.microsoft.com/office/word/2010/wordprocessingCanvas" xmlns:cx="http://schemas.microsoft.com/office/drawing/2014/chartex" xmlns:cx1="http://schemas.microsoft.com/office/drawing/2015/9/8/chartex" xmlns:cx2="http://schemas.microsoft.com/office/drawing/2015/10/21/chartex" xmlns:cx3="http://schemas.microsoft.com/office/drawing/2016/5/9/chartex" xmlns:cx4="http://schemas.microsoft.com/office/drawing/2016/5/10/chartex" xmlns:cx5="http://schemas.microsoft.com/office/drawing/2016/5/11/chartex" xmlns:cx6="http://schemas.microsoft.com/office/drawing/2016/5/12/chartex" xmlns:cx7="http://schemas.microsoft.com/office/drawing/2016/5/13/chartex" xmlns:cx8="http://schemas.microsoft.com/office/drawing/2016/5/14/chartex" xmlns:mc="http://schemas.openxmlformats.org/markup-compatibility/2006" xmlns:aink="http://schemas.microsoft.com/office/drawing/2016/ink" xmlns:am3d="http://schemas.microsoft.com/office/drawing/2017/model3d" xmlns:o="urn:schemas-microsoft-com:office:office" xmlns:oel="http://schemas.microsoft.com/office/2019/extlst" xmlns:r="http://schemas.openxmlformats.org/officeDocument/2006/relationships" xmlns:m="http://schemas.openxmlformats.org/officeDocument/2006/math" xmlns:v="urn:schemas-microsoft-com:vml" xmlns:wp14="http://schemas.microsoft.com/office/word/2010/wordprocessingDrawing" xmlns:wp="http://schemas.openxmlformats.org/drawingml/2006/wordprocessingDrawing" xmlns:w10="urn:schemas-microsoft-com:office:word" xmlns:w="http://schemas.openxmlformats.org/wordprocessingml/2006/main" xmlns:w14="http://schemas.microsoft.com/office/word/2010/wordml" xmlns:w15="http://schemas.microsoft.com/office/word/2012/wordml" xmlns:w16cex="http://schemas.microsoft.com/office/word/2018/wordml/cex" xmlns:w16cid="http://schemas.microsoft.com/office/word/2016/wordml/cid" xmlns:w16="http://schemas.microsoft.com/office/word/2018/wordml" xmlns:w16du="http://schemas.microsoft.com/office/word/2023/wordml/word16du" xmlns:w16sdtdh="http://schemas.microsoft.com/office/word/2020/wordml/sdtdatahash" xmlns:w16sdtfl="http://schemas.microsoft.com/office/word/2024/wordml/sdtformatlock" xmlns:w16se="http://schemas.microsoft.com/office/word/2015/wordml/symex" xmlns:wpg="http://schemas.microsoft.com/office/word/2010/wordprocessingGroup" xmlns:wpi="http://schemas.microsoft.com/office/word/2010/wordprocessingInk" xmlns:wne="http://schemas.microsoft.com/office/word/2006/wordml" xmlns:wps="http://schemas.microsoft.com/office/word/2010/wordprocessingShape" mc:Ignorable="w14 w15 w16se w16cid w16 w16cex w16sdtdh w16sdtfl w16du wp14">
-  <w:p>
-    <w:pPr>
-      <w:pStyle w:val="Footer"/>
-    </w:pPr>
-  </w:p>
-</w:ftr>
-</file>
-
 <file path=word/footnotes.xml><?xml version="1.0" encoding="utf-8"?>
-<w:footnotes xmlns:wpc="http://schemas.microsoft.com/office/word/2010/wordprocessingCanvas" xmlns:cx="http://schemas.microsoft.com/office/drawing/2014/chartex" xmlns:cx1="http://schemas.microsoft.com/office/drawing/2015/9/8/chartex" xmlns:cx2="http://schemas.microsoft.com/office/drawing/2015/10/21/chartex" xmlns:cx3="http://schemas.microsoft.com/office/drawing/2016/5/9/chartex" xmlns:cx4="http://schemas.microsoft.com/office/drawing/2016/5/10/chartex" xmlns:cx5="http://schemas.microsoft.com/office/drawing/2016/5/11/chartex" xmlns:cx6="http://schemas.microsoft.com/office/drawing/2016/5/12/chartex" xmlns:cx7="http://schemas.microsoft.com/office/drawing/2016/5/13/chartex" xmlns:cx8="http://schemas.microsoft.com/office/drawing/2016/5/14/chartex" xmlns:mc="http://schemas.openxmlformats.org/markup-compatibility/2006" xmlns:aink="http://schemas.microsoft.com/office/drawing/2016/ink" xmlns:am3d="http://schemas.microsoft.com/office/drawing/2017/model3d" xmlns:o="urn:schemas-microsoft-com:office:office" xmlns:oel="http://schemas.microsoft.com/office/2019/extlst" xmlns:r="http://schemas.openxmlformats.org/officeDocument/2006/relationships" xmlns:m="http://schemas.openxmlformats.org/officeDocument/2006/math" xmlns:v="urn:schemas-microsoft-com:vml" xmlns:wp14="http://schemas.microsoft.com/office/word/2010/wordprocessingDrawing" xmlns:wp="http://schemas.openxmlformats.org/drawingml/2006/wordprocessingDrawing" xmlns:w10="urn:schemas-microsoft-com:office:word" xmlns:w="http://schemas.openxmlformats.org/wordprocessingml/2006/main" xmlns:w14="http://schemas.microsoft.com/office/word/2010/wordml" xmlns:w15="http://schemas.microsoft.com/office/word/2012/wordml" xmlns:w16cex="http://schemas.microsoft.com/office/word/2018/wordml/cex" xmlns:w16cid="http://schemas.microsoft.com/office/word/2016/wordml/cid" xmlns:w16="http://schemas.microsoft.com/office/word/2018/wordml" xmlns:w16du="http://schemas.microsoft.com/office/word/2023/wordml/word16du" xmlns:w16sdtdh="http://schemas.microsoft.com/office/word/2020/wordml/sdtdatahash" xmlns:w16sdtfl="http://schemas.microsoft.com/office/word/2024/wordml/sdtformatlock" xmlns:w16se="http://schemas.microsoft.com/office/word/2015/wordml/symex" xmlns:wpg="http://schemas.microsoft.com/office/word/2010/wordprocessingGroup" xmlns:wpi="http://schemas.microsoft.com/office/word/2010/wordprocessingInk" xmlns:wne="http://schemas.microsoft.com/office/word/2006/wordml" xmlns:wps="http://schemas.microsoft.com/office/word/2010/wordprocessingShape" mc:Ignorable="w14 w15 w16se w16cid w16 w16cex w16sdtdh w16sdtfl w16du wp14">
+<w:footnotes xmlns:wpc="http://schemas.microsoft.com/office/word/2010/wordprocessingCanvas" xmlns:cx="http://schemas.microsoft.com/office/drawing/2014/chartex" xmlns:cx1="http://schemas.microsoft.com/office/drawing/2015/9/8/chartex" xmlns:cx2="http://schemas.microsoft.com/office/drawing/2015/10/21/chartex" xmlns:cx3="http://schemas.microsoft.com/office/drawing/2016/5/9/chartex" xmlns:cx4="http://schemas.microsoft.com/office/drawing/2016/5/10/chartex" xmlns:cx5="http://schemas.microsoft.com/office/drawing/2016/5/11/chartex" xmlns:cx6="http://schemas.microsoft.com/office/drawing/2016/5/12/chartex" xmlns:cx7="http://schemas.microsoft.com/office/drawing/2016/5/13/chartex" xmlns:cx8="http://schemas.microsoft.com/office/drawing/2016/5/14/chartex" xmlns:mc="http://schemas.openxmlformats.org/markup-compatibility/2006" xmlns:aink="http://schemas.microsoft.com/office/drawing/2016/ink" xmlns:am3d="http://schemas.microsoft.com/office/drawing/2017/model3d" xmlns:o="urn:schemas-microsoft-com:office:office" xmlns:oel="http://schemas.microsoft.com/office/2019/extlst" xmlns:r="http://schemas.openxmlformats.org/officeDocument/2006/relationships" xmlns:m="http://schemas.openxmlformats.org/officeDocument/2006/math" xmlns:v="urn:schemas-microsoft-com:vml" xmlns:wp14="http://schemas.microsoft.com/office/word/2010/wordprocessingDrawing" xmlns:wp="http://schemas.openxmlformats.org/drawingml/2006/wordprocessingDrawing" xmlns:w10="urn:schemas-microsoft-com:office:word" xmlns:w="http://schemas.openxmlformats.org/wordprocessingml/2006/main" xmlns:w14="http://schemas.microsoft.com/office/word/2010/wordml" xmlns:w15="http://schemas.microsoft.com/office/word/2012/wordml" xmlns:w16cei="http://schemas.microsoft.com/office/word/2026/wordml/cei" xmlns:w16cex="http://schemas.microsoft.com/office/word/2018/wordml/cex" xmlns:w16cid="http://schemas.microsoft.com/office/word/2016/wordml/cid" xmlns:w16="http://schemas.microsoft.com/office/word/2018/wordml" xmlns:w16du="http://schemas.microsoft.com/office/word/2023/wordml/word16du" xmlns:w16sdtdh="http://schemas.microsoft.com/office/word/2020/wordml/sdtdatahash" xmlns:w16sdtfl="http://schemas.microsoft.com/office/word/2024/wordml/sdtformatlock" xmlns:w16se="http://schemas.microsoft.com/office/word/2015/wordml/symex" xmlns:wpg="http://schemas.microsoft.com/office/word/2010/wordprocessingGroup" xmlns:wpi="http://schemas.microsoft.com/office/word/2010/wordprocessingInk" xmlns:wne="http://schemas.microsoft.com/office/word/2006/wordml" xmlns:wps="http://schemas.microsoft.com/office/word/2010/wordprocessingShape" mc:Ignorable="w14 w15 w16se w16cid w16 w16cex w16sdtdh w16sdtfl w16du wp14">
   <w:footnote w:type="separator" w:id="-1">
     <w:p>
       <w:pPr>
@@ -999,17 +1100,7 @@
 </file>
 
 <file path=word/header1.xml><?xml version="1.0" encoding="utf-8"?>
-<w:hdr xmlns:wpc="http://schemas.microsoft.com/office/word/2010/wordprocessingCanvas" xmlns:cx="http://schemas.microsoft.com/office/drawing/2014/chartex" xmlns:cx1="http://schemas.microsoft.com/office/drawing/2015/9/8/chartex" xmlns:cx2="http://schemas.microsoft.com/office/drawing/2015/10/21/chartex" xmlns:cx3="http://schemas.microsoft.com/office/drawing/2016/5/9/chartex" xmlns:cx4="http://schemas.microsoft.com/office/drawing/2016/5/10/chartex" xmlns:cx5="http://schemas.microsoft.com/office/drawing/2016/5/11/chartex" xmlns:cx6="http://schemas.microsoft.com/office/drawing/2016/5/12/chartex" xmlns:cx7="http://schemas.microsoft.com/office/drawing/2016/5/13/chartex" xmlns:cx8="http://schemas.microsoft.com/office/drawing/2016/5/14/chartex" xmlns:mc="http://schemas.openxmlformats.org/markup-compatibility/2006" xmlns:aink="http://schemas.microsoft.com/office/drawing/2016/ink" xmlns:am3d="http://schemas.microsoft.com/office/drawing/2017/model3d" xmlns:o="urn:schemas-microsoft-com:office:office" xmlns:oel="http://schemas.microsoft.com/office/2019/extlst" xmlns:r="http://schemas.openxmlformats.org/officeDocument/2006/relationships" xmlns:m="http://schemas.openxmlformats.org/officeDocument/2006/math" xmlns:v="urn:schemas-microsoft-com:vml" xmlns:wp14="http://schemas.microsoft.com/office/word/2010/wordprocessingDrawing" xmlns:wp="http://schemas.openxmlformats.org/drawingml/2006/wordprocessingDrawing" xmlns:w10="urn:schemas-microsoft-com:office:word" xmlns:w="http://schemas.openxmlformats.org/wordprocessingml/2006/main" xmlns:w14="http://schemas.microsoft.com/office/word/2010/wordml" xmlns:w15="http://schemas.microsoft.com/office/word/2012/wordml" xmlns:w16cex="http://schemas.microsoft.com/office/word/2018/wordml/cex" xmlns:w16cid="http://schemas.microsoft.com/office/word/2016/wordml/cid" xmlns:w16="http://schemas.microsoft.com/office/word/2018/wordml" xmlns:w16du="http://schemas.microsoft.com/office/word/2023/wordml/word16du" xmlns:w16sdtdh="http://schemas.microsoft.com/office/word/2020/wordml/sdtdatahash" xmlns:w16sdtfl="http://schemas.microsoft.com/office/word/2024/wordml/sdtformatlock" xmlns:w16se="http://schemas.microsoft.com/office/word/2015/wordml/symex" xmlns:wpg="http://schemas.microsoft.com/office/word/2010/wordprocessingGroup" xmlns:wpi="http://schemas.microsoft.com/office/word/2010/wordprocessingInk" xmlns:wne="http://schemas.microsoft.com/office/word/2006/wordml" xmlns:wps="http://schemas.microsoft.com/office/word/2010/wordprocessingShape" mc:Ignorable="w14 w15 w16se w16cid w16 w16cex w16sdtdh w16sdtfl w16du wp14">
-  <w:p>
-    <w:pPr>
-      <w:pStyle w:val="Header"/>
-    </w:pPr>
-  </w:p>
-</w:hdr>
-</file>
-
-<file path=word/header2.xml><?xml version="1.0" encoding="utf-8"?>
-<w:hdr xmlns:wpc="http://schemas.microsoft.com/office/word/2010/wordprocessingCanvas" xmlns:cx="http://schemas.microsoft.com/office/drawing/2014/chartex" xmlns:cx1="http://schemas.microsoft.com/office/drawing/2015/9/8/chartex" xmlns:cx2="http://schemas.microsoft.com/office/drawing/2015/10/21/chartex" xmlns:cx3="http://schemas.microsoft.com/office/drawing/2016/5/9/chartex" xmlns:cx4="http://schemas.microsoft.com/office/drawing/2016/5/10/chartex" xmlns:cx5="http://schemas.microsoft.com/office/drawing/2016/5/11/chartex" xmlns:cx6="http://schemas.microsoft.com/office/drawing/2016/5/12/chartex" xmlns:cx7="http://schemas.microsoft.com/office/drawing/2016/5/13/chartex" xmlns:cx8="http://schemas.microsoft.com/office/drawing/2016/5/14/chartex" xmlns:mc="http://schemas.openxmlformats.org/markup-compatibility/2006" xmlns:aink="http://schemas.microsoft.com/office/drawing/2016/ink" xmlns:am3d="http://schemas.microsoft.com/office/drawing/2017/model3d" xmlns:o="urn:schemas-microsoft-com:office:office" xmlns:oel="http://schemas.microsoft.com/office/2019/extlst" xmlns:r="http://schemas.openxmlformats.org/officeDocument/2006/relationships" xmlns:m="http://schemas.openxmlformats.org/officeDocument/2006/math" xmlns:v="urn:schemas-microsoft-com:vml" xmlns:wp14="http://schemas.microsoft.com/office/word/2010/wordprocessingDrawing" xmlns:wp="http://schemas.openxmlformats.org/drawingml/2006/wordprocessingDrawing" xmlns:w10="urn:schemas-microsoft-com:office:word" xmlns:w="http://schemas.openxmlformats.org/wordprocessingml/2006/main" xmlns:w14="http://schemas.microsoft.com/office/word/2010/wordml" xmlns:w15="http://schemas.microsoft.com/office/word/2012/wordml" xmlns:w16cex="http://schemas.microsoft.com/office/word/2018/wordml/cex" xmlns:w16cid="http://schemas.microsoft.com/office/word/2016/wordml/cid" xmlns:w16="http://schemas.microsoft.com/office/word/2018/wordml" xmlns:w16du="http://schemas.microsoft.com/office/word/2023/wordml/word16du" xmlns:w16sdtdh="http://schemas.microsoft.com/office/word/2020/wordml/sdtdatahash" xmlns:w16sdtfl="http://schemas.microsoft.com/office/word/2024/wordml/sdtformatlock" xmlns:w16se="http://schemas.microsoft.com/office/word/2015/wordml/symex" xmlns:wpg="http://schemas.microsoft.com/office/word/2010/wordprocessingGroup" xmlns:wpi="http://schemas.microsoft.com/office/word/2010/wordprocessingInk" xmlns:wne="http://schemas.microsoft.com/office/word/2006/wordml" xmlns:wps="http://schemas.microsoft.com/office/word/2010/wordprocessingShape" mc:Ignorable="w14 w15 w16se w16cid w16 w16cex w16sdtdh w16sdtfl w16du wp14">
+<w:hdr xmlns:wpc="http://schemas.microsoft.com/office/word/2010/wordprocessingCanvas" xmlns:cx="http://schemas.microsoft.com/office/drawing/2014/chartex" xmlns:cx1="http://schemas.microsoft.com/office/drawing/2015/9/8/chartex" xmlns:cx2="http://schemas.microsoft.com/office/drawing/2015/10/21/chartex" xmlns:cx3="http://schemas.microsoft.com/office/drawing/2016/5/9/chartex" xmlns:cx4="http://schemas.microsoft.com/office/drawing/2016/5/10/chartex" xmlns:cx5="http://schemas.microsoft.com/office/drawing/2016/5/11/chartex" xmlns:cx6="http://schemas.microsoft.com/office/drawing/2016/5/12/chartex" xmlns:cx7="http://schemas.microsoft.com/office/drawing/2016/5/13/chartex" xmlns:cx8="http://schemas.microsoft.com/office/drawing/2016/5/14/chartex" xmlns:mc="http://schemas.openxmlformats.org/markup-compatibility/2006" xmlns:aink="http://schemas.microsoft.com/office/drawing/2016/ink" xmlns:am3d="http://schemas.microsoft.com/office/drawing/2017/model3d" xmlns:o="urn:schemas-microsoft-com:office:office" xmlns:oel="http://schemas.microsoft.com/office/2019/extlst" xmlns:r="http://schemas.openxmlformats.org/officeDocument/2006/relationships" xmlns:m="http://schemas.openxmlformats.org/officeDocument/2006/math" xmlns:v="urn:schemas-microsoft-com:vml" xmlns:wp14="http://schemas.microsoft.com/office/word/2010/wordprocessingDrawing" xmlns:wp="http://schemas.openxmlformats.org/drawingml/2006/wordprocessingDrawing" xmlns:w10="urn:schemas-microsoft-com:office:word" xmlns:w="http://schemas.openxmlformats.org/wordprocessingml/2006/main" xmlns:w14="http://schemas.microsoft.com/office/word/2010/wordml" xmlns:w15="http://schemas.microsoft.com/office/word/2012/wordml" xmlns:w16cei="http://schemas.microsoft.com/office/word/2026/wordml/cei" xmlns:w16cex="http://schemas.microsoft.com/office/word/2018/wordml/cex" xmlns:w16cid="http://schemas.microsoft.com/office/word/2016/wordml/cid" xmlns:w16="http://schemas.microsoft.com/office/word/2018/wordml" xmlns:w16du="http://schemas.microsoft.com/office/word/2023/wordml/word16du" xmlns:w16sdtdh="http://schemas.microsoft.com/office/word/2020/wordml/sdtdatahash" xmlns:w16sdtfl="http://schemas.microsoft.com/office/word/2024/wordml/sdtformatlock" xmlns:w16se="http://schemas.microsoft.com/office/word/2015/wordml/symex" xmlns:wpg="http://schemas.microsoft.com/office/word/2010/wordprocessingGroup" xmlns:wpi="http://schemas.microsoft.com/office/word/2010/wordprocessingInk" xmlns:wne="http://schemas.microsoft.com/office/word/2006/wordml" xmlns:wps="http://schemas.microsoft.com/office/word/2010/wordprocessingShape" mc:Ignorable="w14 w15 w16se w16cid w16 w16cex w16sdtdh w16sdtfl w16du wp14">
   <w:p>
     <w:pPr>
       <w:pStyle w:val="Header"/>
@@ -1099,16 +1190,16 @@
       <mc:AlternateContent>
         <mc:Choice Requires="wps">
           <w:drawing>
-            <wp:anchor distT="0" distB="0" distL="114300" distR="114300" simplePos="0" relativeHeight="251659264" behindDoc="0" locked="1" layoutInCell="0" allowOverlap="1" wp14:anchorId="69357E9D" wp14:editId="7D2D90D1">
+            <wp:anchor distT="0" distB="0" distL="114300" distR="114300" simplePos="0" relativeHeight="251659264" behindDoc="0" locked="1" layoutInCell="0" allowOverlap="1" wp14:anchorId="69357E9D" wp14:editId="4A304C6F">
               <wp:simplePos x="0" y="0"/>
               <wp:positionH relativeFrom="column">
-                <wp:posOffset>4658360</wp:posOffset>
+                <wp:posOffset>4657725</wp:posOffset>
               </wp:positionH>
               <wp:positionV relativeFrom="paragraph">
                 <wp:posOffset>-152400</wp:posOffset>
               </wp:positionV>
-              <wp:extent cx="1911350" cy="893445"/>
-              <wp:effectExtent l="0" t="0" r="0" b="1905"/>
+              <wp:extent cx="1911350" cy="1047750"/>
+              <wp:effectExtent l="0" t="0" r="0" b="0"/>
               <wp:wrapNone/>
               <wp:docPr id="2" name="Text Box 2"/>
               <wp:cNvGraphicFramePr>
@@ -1123,7 +1214,7 @@
                     <wps:spPr bwMode="auto">
                       <a:xfrm>
                         <a:off x="0" y="0"/>
-                        <a:ext cx="1911350" cy="893445"/>
+                        <a:ext cx="1911350" cy="1047750"/>
                       </a:xfrm>
                       <a:prstGeom prst="rect">
                         <a:avLst/>
@@ -1165,7 +1256,7 @@
                               <w:rFonts w:ascii="Times New Roman" w:hAnsi="Times New Roman"/>
                               <w:sz w:val="14"/>
                               <w:szCs w:val="14"/>
-                              <w:lang w:val="en-US"/>
+                              <w:lang w:val="fr-FR"/>
                             </w:rPr>
                           </w:pPr>
                           <w:r>
@@ -1173,41 +1264,29 @@
                               <w:rFonts w:ascii="Times New Roman" w:hAnsi="Times New Roman"/>
                               <w:sz w:val="14"/>
                               <w:szCs w:val="14"/>
-                              <w:lang w:val="en-US"/>
+                              <w:lang w:val="fr-FR"/>
                             </w:rPr>
-                            <w:t>PPC Barnet DRC Manufacturing SA</w:t>
+                            <w:t xml:space="preserve">PPC Barnet DRC </w:t>
                           </w:r>
-                        </w:p>
-                        <w:p>
-                          <w:pPr>
-                            <w:tabs>
-                              <w:tab w:val="left" w:pos="434"/>
-                            </w:tabs>
-                            <w:spacing w:after="0" w:line="240" w:lineRule="auto"/>
+                          <w:proofErr w:type="spellStart"/>
+                          <w:r>
                             <w:rPr>
-                              <w:rFonts w:ascii="Times New Roman" w:hAnsi="Times New Roman" w:cs="Times New Roman"/>
+                              <w:rFonts w:ascii="Times New Roman" w:hAnsi="Times New Roman"/>
                               <w:sz w:val="14"/>
                               <w:szCs w:val="14"/>
                               <w:lang w:val="fr-FR"/>
                             </w:rPr>
-                          </w:pPr>
+                            <w:t>Manufacturing</w:t>
+                          </w:r>
+                          <w:proofErr w:type="spellEnd"/>
                           <w:r>
                             <w:rPr>
-                              <w:rFonts w:ascii="Times New Roman" w:hAnsi="Times New Roman" w:cs="Times New Roman"/>
-                              <w:sz w:val="14"/>
-                              <w:szCs w:val="14"/>
-                              <w:lang w:val="en-US"/>
-                            </w:rPr>
-                            <w:t xml:space="preserve">63, av. </w:t>
-                          </w:r>
-                          <w:r>
-                            <w:rPr>
-                              <w:rFonts w:ascii="Times New Roman" w:hAnsi="Times New Roman" w:cs="Times New Roman"/>
+                              <w:rFonts w:ascii="Times New Roman" w:hAnsi="Times New Roman"/>
                               <w:sz w:val="14"/>
                               <w:szCs w:val="14"/>
                               <w:lang w:val="fr-FR"/>
                             </w:rPr>
-                            <w:t>Colonel Mondjiba, Concession COTEX</w:t>
+                            <w:t xml:space="preserve"> SA</w:t>
                           </w:r>
                         </w:p>
                         <w:p>
@@ -1230,7 +1309,79 @@
                               <w:szCs w:val="14"/>
                               <w:lang w:val="fr-FR"/>
                             </w:rPr>
-                            <w:t>(Silikin Village), Kinshasa/Ngaliema.</w:t>
+                            <w:t>5</w:t>
+                          </w:r>
+                          <w:r>
+                            <w:rPr>
+                              <w:rFonts w:ascii="Times New Roman" w:hAnsi="Times New Roman" w:cs="Times New Roman"/>
+                              <w:sz w:val="14"/>
+                              <w:szCs w:val="14"/>
+                              <w:lang w:val="en-US"/>
+                            </w:rPr>
+                            <w:t>ᵉ</w:t>
+                          </w:r>
+                          <w:r>
+                            <w:rPr>
+                              <w:rFonts w:ascii="Times New Roman" w:hAnsi="Times New Roman" w:cs="Times New Roman"/>
+                              <w:sz w:val="14"/>
+                              <w:szCs w:val="14"/>
+                              <w:lang w:val="fr-FR"/>
+                            </w:rPr>
+                            <w:t xml:space="preserve"> étage</w:t>
+                          </w:r>
+                          <w:r>
+                            <w:rPr>
+                              <w:rFonts w:ascii="Times New Roman" w:hAnsi="Times New Roman" w:cs="Times New Roman"/>
+                              <w:sz w:val="14"/>
+                              <w:szCs w:val="14"/>
+                              <w:lang w:val="fr-FR"/>
+                            </w:rPr>
+                            <w:t>,</w:t>
+                          </w:r>
+                          <w:r>
+                            <w:rPr>
+                              <w:rFonts w:ascii="Times New Roman" w:hAnsi="Times New Roman" w:cs="Times New Roman"/>
+                              <w:sz w:val="14"/>
+                              <w:szCs w:val="14"/>
+                              <w:lang w:val="fr-FR"/>
+                            </w:rPr>
+                            <w:t xml:space="preserve"> </w:t>
+                          </w:r>
+                          <w:r>
+                            <w:rPr>
+                              <w:rFonts w:ascii="Times New Roman" w:hAnsi="Times New Roman" w:cs="Times New Roman"/>
+                              <w:sz w:val="14"/>
+                              <w:szCs w:val="14"/>
+                              <w:lang w:val="fr-FR"/>
+                            </w:rPr>
+                            <w:t xml:space="preserve">Immeuble </w:t>
+                          </w:r>
+                          <w:r>
+                            <w:rPr>
+                              <w:rFonts w:ascii="Times New Roman" w:hAnsi="Times New Roman" w:cs="Times New Roman"/>
+                              <w:sz w:val="14"/>
+                              <w:szCs w:val="14"/>
+                              <w:lang w:val="fr-FR"/>
+                            </w:rPr>
+                            <w:t>l</w:t>
+                          </w:r>
+                          <w:r>
+                            <w:rPr>
+                              <w:rFonts w:ascii="Times New Roman" w:hAnsi="Times New Roman" w:cs="Times New Roman"/>
+                              <w:sz w:val="14"/>
+                              <w:szCs w:val="14"/>
+                              <w:lang w:val="fr-FR"/>
+                            </w:rPr>
+                            <w:t>a Promenade</w:t>
+                          </w:r>
+                          <w:r>
+                            <w:rPr>
+                              <w:rFonts w:ascii="Times New Roman" w:hAnsi="Times New Roman" w:cs="Times New Roman"/>
+                              <w:sz w:val="14"/>
+                              <w:szCs w:val="14"/>
+                              <w:lang w:val="fr-FR"/>
+                            </w:rPr>
+                            <w:t xml:space="preserve"> 2, </w:t>
                           </w:r>
                         </w:p>
                         <w:p>
@@ -1253,7 +1404,88 @@
                               <w:szCs w:val="14"/>
                               <w:lang w:val="fr-FR"/>
                             </w:rPr>
-                            <w:t xml:space="preserve">Email : </w:t>
+                            <w:t>C</w:t>
+                          </w:r>
+                          <w:r>
+                            <w:rPr>
+                              <w:rFonts w:ascii="Times New Roman" w:hAnsi="Times New Roman" w:cs="Times New Roman"/>
+                              <w:sz w:val="14"/>
+                              <w:szCs w:val="14"/>
+                              <w:lang w:val="fr-FR"/>
+                            </w:rPr>
+                            <w:t xml:space="preserve">roisement des avenues </w:t>
+                          </w:r>
+                          <w:r>
+                            <w:rPr>
+                              <w:rFonts w:ascii="Times New Roman" w:hAnsi="Times New Roman" w:cs="Times New Roman"/>
+                              <w:sz w:val="14"/>
+                              <w:szCs w:val="14"/>
+                              <w:lang w:val="fr-FR"/>
+                            </w:rPr>
+                            <w:t>OUA</w:t>
+                          </w:r>
+                          <w:r>
+                            <w:rPr>
+                              <w:rFonts w:ascii="Times New Roman" w:hAnsi="Times New Roman" w:cs="Times New Roman"/>
+                              <w:sz w:val="14"/>
+                              <w:szCs w:val="14"/>
+                              <w:lang w:val="fr-FR"/>
+                            </w:rPr>
+                            <w:t xml:space="preserve"> et Massamba, </w:t>
+                          </w:r>
+                          <w:proofErr w:type="gramStart"/>
+                          <w:r>
+                            <w:rPr>
+                              <w:rFonts w:ascii="Times New Roman" w:hAnsi="Times New Roman" w:cs="Times New Roman"/>
+                              <w:sz w:val="14"/>
+                              <w:szCs w:val="14"/>
+                              <w:lang w:val="fr-FR"/>
+                            </w:rPr>
+                            <w:t>Quartier  Basoko</w:t>
+                          </w:r>
+                          <w:proofErr w:type="gramEnd"/>
+                          <w:r>
+                            <w:rPr>
+                              <w:rFonts w:ascii="Times New Roman" w:hAnsi="Times New Roman" w:cs="Times New Roman"/>
+                              <w:sz w:val="14"/>
+                              <w:szCs w:val="14"/>
+                              <w:lang w:val="fr-FR"/>
+                            </w:rPr>
+                            <w:t>, Commune de Ngaliema.</w:t>
+                          </w:r>
+                        </w:p>
+                        <w:p>
+                          <w:pPr>
+                            <w:tabs>
+                              <w:tab w:val="left" w:pos="434"/>
+                            </w:tabs>
+                            <w:spacing w:after="0" w:line="240" w:lineRule="auto"/>
+                            <w:rPr>
+                              <w:rFonts w:ascii="Times New Roman" w:hAnsi="Times New Roman" w:cs="Times New Roman"/>
+                              <w:sz w:val="14"/>
+                              <w:szCs w:val="14"/>
+                              <w:lang w:val="en-US"/>
+                            </w:rPr>
+                          </w:pPr>
+                          <w:proofErr w:type="gramStart"/>
+                          <w:r>
+                            <w:rPr>
+                              <w:rFonts w:ascii="Times New Roman" w:hAnsi="Times New Roman" w:cs="Times New Roman"/>
+                              <w:sz w:val="14"/>
+                              <w:szCs w:val="14"/>
+                              <w:lang w:val="en-US"/>
+                            </w:rPr>
+                            <w:t>Email :</w:t>
+                          </w:r>
+                          <w:proofErr w:type="gramEnd"/>
+                          <w:r>
+                            <w:rPr>
+                              <w:rFonts w:ascii="Times New Roman" w:hAnsi="Times New Roman" w:cs="Times New Roman"/>
+                              <w:sz w:val="14"/>
+                              <w:szCs w:val="14"/>
+                              <w:lang w:val="en-US"/>
+                            </w:rPr>
+                            <w:t xml:space="preserve"> </w:t>
                           </w:r>
                           <w:hyperlink r:id="rId2" w:history="1">
                             <w:r>
@@ -1262,7 +1494,7 @@
                                 <w:rFonts w:ascii="Times New Roman" w:hAnsi="Times New Roman" w:cs="Times New Roman"/>
                                 <w:sz w:val="14"/>
                                 <w:szCs w:val="14"/>
-                                <w:lang w:val="fr-FR"/>
+                                <w:lang w:val="en-US"/>
                               </w:rPr>
                               <w:t>Reception.HQ@ppcdrc.cd</w:t>
                             </w:r>
@@ -1282,6 +1514,7 @@
                               <w:lang w:val="en-US"/>
                             </w:rPr>
                           </w:pPr>
+                          <w:proofErr w:type="gramStart"/>
                           <w:r>
                             <w:rPr>
                               <w:rFonts w:ascii="Times New Roman" w:hAnsi="Times New Roman"/>
@@ -1289,7 +1522,17 @@
                               <w:szCs w:val="14"/>
                               <w:lang w:val="en-US"/>
                             </w:rPr>
-                            <w:t>Tel  +243 899922864</w:t>
+                            <w:t>Tel  +</w:t>
+                          </w:r>
+                          <w:proofErr w:type="gramEnd"/>
+                          <w:r>
+                            <w:rPr>
+                              <w:rFonts w:ascii="Times New Roman" w:hAnsi="Times New Roman"/>
+                              <w:sz w:val="14"/>
+                              <w:szCs w:val="14"/>
+                              <w:lang w:val="en-US"/>
+                            </w:rPr>
+                            <w:t>243 899922864</w:t>
                           </w:r>
                         </w:p>
                         <w:p>
@@ -1343,14 +1586,35 @@
                               <w:szCs w:val="14"/>
                             </w:rPr>
                           </w:pPr>
+                          <w:proofErr w:type="spellStart"/>
                           <w:r>
                             <w:rPr>
                               <w:rFonts w:ascii="Times New Roman" w:hAnsi="Times New Roman"/>
                               <w:sz w:val="14"/>
                               <w:szCs w:val="14"/>
                             </w:rPr>
-                            <w:t>Numéro impot A1402387L</w:t>
+                            <w:t>Numéro</w:t>
                           </w:r>
+                          <w:proofErr w:type="spellEnd"/>
+                          <w:r>
+                            <w:rPr>
+                              <w:rFonts w:ascii="Times New Roman" w:hAnsi="Times New Roman"/>
+                              <w:sz w:val="14"/>
+                              <w:szCs w:val="14"/>
+                            </w:rPr>
+                            <w:t xml:space="preserve"> impot A1402387L</w:t>
+                          </w:r>
+                        </w:p>
+                        <w:p>
+                          <w:pPr>
+                            <w:pStyle w:val="Address"/>
+                            <w:spacing w:line="240" w:lineRule="auto"/>
+                            <w:rPr>
+                              <w:rFonts w:ascii="Times New Roman" w:hAnsi="Times New Roman"/>
+                              <w:sz w:val="14"/>
+                              <w:szCs w:val="14"/>
+                            </w:rPr>
+                          </w:pPr>
                         </w:p>
                         <w:p>
                           <w:pPr>
@@ -1386,7 +1650,7 @@
               <v:stroke joinstyle="miter"/>
               <v:path gradientshapeok="t" o:connecttype="rect"/>
             </v:shapetype>
-            <v:shape id="Text Box 2" o:spid="_x0000_s1026" type="#_x0000_t202" style="position:absolute;left:0;text-align:left;margin-left:366.8pt;margin-top:-12pt;width:150.5pt;height:70.35pt;z-index:251659264;visibility:visible;mso-wrap-style:square;mso-width-percent:0;mso-height-percent:0;mso-wrap-distance-left:9pt;mso-wrap-distance-top:0;mso-wrap-distance-right:9pt;mso-wrap-distance-bottom:0;mso-position-horizontal:absolute;mso-position-horizontal-relative:text;mso-position-vertical:absolute;mso-position-vertical-relative:text;mso-width-percent:0;mso-height-percent:0;mso-width-relative:page;mso-height-relative:page;v-text-anchor:top" o:gfxdata="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" o:allowincell="f" filled="f" stroked="f">
+            <v:shape id="Text Box 2" o:spid="_x0000_s1026" type="#_x0000_t202" style="position:absolute;left:0;text-align:left;margin-left:366.75pt;margin-top:-12pt;width:150.5pt;height:82.5pt;z-index:251659264;visibility:visible;mso-wrap-style:square;mso-width-percent:0;mso-height-percent:0;mso-wrap-distance-left:9pt;mso-wrap-distance-top:0;mso-wrap-distance-right:9pt;mso-wrap-distance-bottom:0;mso-position-horizontal:absolute;mso-position-horizontal-relative:text;mso-position-vertical:absolute;mso-position-vertical-relative:text;mso-width-percent:0;mso-height-percent:0;mso-width-relative:page;mso-height-relative:page;v-text-anchor:top" o:gfxdata="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" o:allowincell="f" filled="f" stroked="f">
               <v:textbox>
                 <w:txbxContent>
                   <w:p>
@@ -1400,7 +1664,7 @@
                         <w:rFonts w:ascii="Times New Roman" w:hAnsi="Times New Roman"/>
                         <w:sz w:val="14"/>
                         <w:szCs w:val="14"/>
-                        <w:lang w:val="en-US"/>
+                        <w:lang w:val="fr-FR"/>
                       </w:rPr>
                     </w:pPr>
                     <w:r>
@@ -1408,41 +1672,29 @@
                         <w:rFonts w:ascii="Times New Roman" w:hAnsi="Times New Roman"/>
                         <w:sz w:val="14"/>
                         <w:szCs w:val="14"/>
-                        <w:lang w:val="en-US"/>
+                        <w:lang w:val="fr-FR"/>
                       </w:rPr>
-                      <w:t>PPC Barnet DRC Manufacturing SA</w:t>
+                      <w:t xml:space="preserve">PPC Barnet DRC </w:t>
                     </w:r>
-                  </w:p>
-                  <w:p>
-                    <w:pPr>
-                      <w:tabs>
-                        <w:tab w:val="left" w:pos="434"/>
-                      </w:tabs>
-                      <w:spacing w:after="0" w:line="240" w:lineRule="auto"/>
+                    <w:proofErr w:type="spellStart"/>
+                    <w:r>
                       <w:rPr>
-                        <w:rFonts w:ascii="Times New Roman" w:hAnsi="Times New Roman" w:cs="Times New Roman"/>
+                        <w:rFonts w:ascii="Times New Roman" w:hAnsi="Times New Roman"/>
                         <w:sz w:val="14"/>
                         <w:szCs w:val="14"/>
                         <w:lang w:val="fr-FR"/>
                       </w:rPr>
-                    </w:pPr>
+                      <w:t>Manufacturing</w:t>
+                    </w:r>
+                    <w:proofErr w:type="spellEnd"/>
                     <w:r>
                       <w:rPr>
-                        <w:rFonts w:ascii="Times New Roman" w:hAnsi="Times New Roman" w:cs="Times New Roman"/>
-                        <w:sz w:val="14"/>
-                        <w:szCs w:val="14"/>
-                        <w:lang w:val="en-US"/>
-                      </w:rPr>
-                      <w:t xml:space="preserve">63, av. </w:t>
-                    </w:r>
-                    <w:r>
-                      <w:rPr>
-                        <w:rFonts w:ascii="Times New Roman" w:hAnsi="Times New Roman" w:cs="Times New Roman"/>
+                        <w:rFonts w:ascii="Times New Roman" w:hAnsi="Times New Roman"/>
                         <w:sz w:val="14"/>
                         <w:szCs w:val="14"/>
                         <w:lang w:val="fr-FR"/>
                       </w:rPr>
-                      <w:t>Colonel Mondjiba, Concession COTEX</w:t>
+                      <w:t xml:space="preserve"> SA</w:t>
                     </w:r>
                   </w:p>
                   <w:p>
@@ -1465,7 +1717,79 @@
                         <w:szCs w:val="14"/>
                         <w:lang w:val="fr-FR"/>
                       </w:rPr>
-                      <w:t>(Silikin Village), Kinshasa/Ngaliema.</w:t>
+                      <w:t>5</w:t>
+                    </w:r>
+                    <w:r>
+                      <w:rPr>
+                        <w:rFonts w:ascii="Times New Roman" w:hAnsi="Times New Roman" w:cs="Times New Roman"/>
+                        <w:sz w:val="14"/>
+                        <w:szCs w:val="14"/>
+                        <w:lang w:val="en-US"/>
+                      </w:rPr>
+                      <w:t>ᵉ</w:t>
+                    </w:r>
+                    <w:r>
+                      <w:rPr>
+                        <w:rFonts w:ascii="Times New Roman" w:hAnsi="Times New Roman" w:cs="Times New Roman"/>
+                        <w:sz w:val="14"/>
+                        <w:szCs w:val="14"/>
+                        <w:lang w:val="fr-FR"/>
+                      </w:rPr>
+                      <w:t xml:space="preserve"> étage</w:t>
+                    </w:r>
+                    <w:r>
+                      <w:rPr>
+                        <w:rFonts w:ascii="Times New Roman" w:hAnsi="Times New Roman" w:cs="Times New Roman"/>
+                        <w:sz w:val="14"/>
+                        <w:szCs w:val="14"/>
+                        <w:lang w:val="fr-FR"/>
+                      </w:rPr>
+                      <w:t>,</w:t>
+                    </w:r>
+                    <w:r>
+                      <w:rPr>
+                        <w:rFonts w:ascii="Times New Roman" w:hAnsi="Times New Roman" w:cs="Times New Roman"/>
+                        <w:sz w:val="14"/>
+                        <w:szCs w:val="14"/>
+                        <w:lang w:val="fr-FR"/>
+                      </w:rPr>
+                      <w:t xml:space="preserve"> </w:t>
+                    </w:r>
+                    <w:r>
+                      <w:rPr>
+                        <w:rFonts w:ascii="Times New Roman" w:hAnsi="Times New Roman" w:cs="Times New Roman"/>
+                        <w:sz w:val="14"/>
+                        <w:szCs w:val="14"/>
+                        <w:lang w:val="fr-FR"/>
+                      </w:rPr>
+                      <w:t xml:space="preserve">Immeuble </w:t>
+                    </w:r>
+                    <w:r>
+                      <w:rPr>
+                        <w:rFonts w:ascii="Times New Roman" w:hAnsi="Times New Roman" w:cs="Times New Roman"/>
+                        <w:sz w:val="14"/>
+                        <w:szCs w:val="14"/>
+                        <w:lang w:val="fr-FR"/>
+                      </w:rPr>
+                      <w:t>l</w:t>
+                    </w:r>
+                    <w:r>
+                      <w:rPr>
+                        <w:rFonts w:ascii="Times New Roman" w:hAnsi="Times New Roman" w:cs="Times New Roman"/>
+                        <w:sz w:val="14"/>
+                        <w:szCs w:val="14"/>
+                        <w:lang w:val="fr-FR"/>
+                      </w:rPr>
+                      <w:t>a Promenade</w:t>
+                    </w:r>
+                    <w:r>
+                      <w:rPr>
+                        <w:rFonts w:ascii="Times New Roman" w:hAnsi="Times New Roman" w:cs="Times New Roman"/>
+                        <w:sz w:val="14"/>
+                        <w:szCs w:val="14"/>
+                        <w:lang w:val="fr-FR"/>
+                      </w:rPr>
+                      <w:t xml:space="preserve"> 2, </w:t>
                     </w:r>
                   </w:p>
                   <w:p>
@@ -1488,7 +1812,88 @@
                         <w:szCs w:val="14"/>
                         <w:lang w:val="fr-FR"/>
                       </w:rPr>
-                      <w:t xml:space="preserve">Email : </w:t>
+                      <w:t>C</w:t>
+                    </w:r>
+                    <w:r>
+                      <w:rPr>
+                        <w:rFonts w:ascii="Times New Roman" w:hAnsi="Times New Roman" w:cs="Times New Roman"/>
+                        <w:sz w:val="14"/>
+                        <w:szCs w:val="14"/>
+                        <w:lang w:val="fr-FR"/>
+                      </w:rPr>
+                      <w:t xml:space="preserve">roisement des avenues </w:t>
+                    </w:r>
+                    <w:r>
+                      <w:rPr>
+                        <w:rFonts w:ascii="Times New Roman" w:hAnsi="Times New Roman" w:cs="Times New Roman"/>
+                        <w:sz w:val="14"/>
+                        <w:szCs w:val="14"/>
+                        <w:lang w:val="fr-FR"/>
+                      </w:rPr>
+                      <w:t>OUA</w:t>
+                    </w:r>
+                    <w:r>
+                      <w:rPr>
+                        <w:rFonts w:ascii="Times New Roman" w:hAnsi="Times New Roman" w:cs="Times New Roman"/>
+                        <w:sz w:val="14"/>
+                        <w:szCs w:val="14"/>
+                        <w:lang w:val="fr-FR"/>
+                      </w:rPr>
+                      <w:t xml:space="preserve"> et Massamba, </w:t>
+                    </w:r>
+                    <w:proofErr w:type="gramStart"/>
+                    <w:r>
+                      <w:rPr>
+                        <w:rFonts w:ascii="Times New Roman" w:hAnsi="Times New Roman" w:cs="Times New Roman"/>
+                        <w:sz w:val="14"/>
+                        <w:szCs w:val="14"/>
+                        <w:lang w:val="fr-FR"/>
+                      </w:rPr>
+                      <w:t>Quartier  Basoko</w:t>
+                    </w:r>
+                    <w:proofErr w:type="gramEnd"/>
+                    <w:r>
+                      <w:rPr>
+                        <w:rFonts w:ascii="Times New Roman" w:hAnsi="Times New Roman" w:cs="Times New Roman"/>
+                        <w:sz w:val="14"/>
+                        <w:szCs w:val="14"/>
+                        <w:lang w:val="fr-FR"/>
+                      </w:rPr>
+                      <w:t>, Commune de Ngaliema.</w:t>
+                    </w:r>
+                  </w:p>
+                  <w:p>
+                    <w:pPr>
+                      <w:tabs>
+                        <w:tab w:val="left" w:pos="434"/>
+                      </w:tabs>
+                      <w:spacing w:after="0" w:line="240" w:lineRule="auto"/>
+                      <w:rPr>
+                        <w:rFonts w:ascii="Times New Roman" w:hAnsi="Times New Roman" w:cs="Times New Roman"/>
+                        <w:sz w:val="14"/>
+                        <w:szCs w:val="14"/>
+                        <w:lang w:val="en-US"/>
+                      </w:rPr>
+                    </w:pPr>
+                    <w:proofErr w:type="gramStart"/>
+                    <w:r>
+                      <w:rPr>
+                        <w:rFonts w:ascii="Times New Roman" w:hAnsi="Times New Roman" w:cs="Times New Roman"/>
+                        <w:sz w:val="14"/>
+                        <w:szCs w:val="14"/>
+                        <w:lang w:val="en-US"/>
+                      </w:rPr>
+                      <w:t>Email :</w:t>
+                    </w:r>
+                    <w:proofErr w:type="gramEnd"/>
+                    <w:r>
+                      <w:rPr>
+                        <w:rFonts w:ascii="Times New Roman" w:hAnsi="Times New Roman" w:cs="Times New Roman"/>
+                        <w:sz w:val="14"/>
+                        <w:szCs w:val="14"/>
+                        <w:lang w:val="en-US"/>
+                      </w:rPr>
+                      <w:t xml:space="preserve"> </w:t>
                     </w:r>
                     <w:hyperlink r:id="rId3" w:history="1">
                       <w:r>
@@ -1497,7 +1902,7 @@
                           <w:rFonts w:ascii="Times New Roman" w:hAnsi="Times New Roman" w:cs="Times New Roman"/>
                           <w:sz w:val="14"/>
                           <w:szCs w:val="14"/>
-                          <w:lang w:val="fr-FR"/>
+                          <w:lang w:val="en-US"/>
                         </w:rPr>
                         <w:t>Reception.HQ@ppcdrc.cd</w:t>
                       </w:r>
@@ -1517,6 +1922,7 @@
                         <w:lang w:val="en-US"/>
                       </w:rPr>
                     </w:pPr>
+                    <w:proofErr w:type="gramStart"/>
                     <w:r>
                       <w:rPr>
                         <w:rFonts w:ascii="Times New Roman" w:hAnsi="Times New Roman"/>
@@ -1524,7 +1930,17 @@
                         <w:szCs w:val="14"/>
                         <w:lang w:val="en-US"/>
                       </w:rPr>
-                      <w:t>Tel  +243 899922864</w:t>
+                      <w:t>Tel  +</w:t>
+                    </w:r>
+                    <w:proofErr w:type="gramEnd"/>
+                    <w:r>
+                      <w:rPr>
+                        <w:rFonts w:ascii="Times New Roman" w:hAnsi="Times New Roman"/>
+                        <w:sz w:val="14"/>
+                        <w:szCs w:val="14"/>
+                        <w:lang w:val="en-US"/>
+                      </w:rPr>
+                      <w:t>243 899922864</w:t>
                     </w:r>
                   </w:p>
                   <w:p>
@@ -1578,14 +1994,35 @@
                         <w:szCs w:val="14"/>
                       </w:rPr>
                     </w:pPr>
+                    <w:proofErr w:type="spellStart"/>
                     <w:r>
                       <w:rPr>
                         <w:rFonts w:ascii="Times New Roman" w:hAnsi="Times New Roman"/>
                         <w:sz w:val="14"/>
                         <w:szCs w:val="14"/>
                       </w:rPr>
-                      <w:t>Numéro impot A1402387L</w:t>
+                      <w:t>Numéro</w:t>
                     </w:r>
+                    <w:proofErr w:type="spellEnd"/>
+                    <w:r>
+                      <w:rPr>
+                        <w:rFonts w:ascii="Times New Roman" w:hAnsi="Times New Roman"/>
+                        <w:sz w:val="14"/>
+                        <w:szCs w:val="14"/>
+                      </w:rPr>
+                      <w:t xml:space="preserve"> impot A1402387L</w:t>
+                    </w:r>
+                  </w:p>
+                  <w:p>
+                    <w:pPr>
+                      <w:pStyle w:val="Address"/>
+                      <w:spacing w:line="240" w:lineRule="auto"/>
+                      <w:rPr>
+                        <w:rFonts w:ascii="Times New Roman" w:hAnsi="Times New Roman"/>
+                        <w:sz w:val="14"/>
+                        <w:szCs w:val="14"/>
+                      </w:rPr>
+                    </w:pPr>
                   </w:p>
                   <w:p>
                     <w:pPr>
@@ -1615,18 +2052,8 @@
 </w:hdr>
 </file>
 
-<file path=word/header3.xml><?xml version="1.0" encoding="utf-8"?>
-<w:hdr xmlns:wpc="http://schemas.microsoft.com/office/word/2010/wordprocessingCanvas" xmlns:cx="http://schemas.microsoft.com/office/drawing/2014/chartex" xmlns:cx1="http://schemas.microsoft.com/office/drawing/2015/9/8/chartex" xmlns:cx2="http://schemas.microsoft.com/office/drawing/2015/10/21/chartex" xmlns:cx3="http://schemas.microsoft.com/office/drawing/2016/5/9/chartex" xmlns:cx4="http://schemas.microsoft.com/office/drawing/2016/5/10/chartex" xmlns:cx5="http://schemas.microsoft.com/office/drawing/2016/5/11/chartex" xmlns:cx6="http://schemas.microsoft.com/office/drawing/2016/5/12/chartex" xmlns:cx7="http://schemas.microsoft.com/office/drawing/2016/5/13/chartex" xmlns:cx8="http://schemas.microsoft.com/office/drawing/2016/5/14/chartex" xmlns:mc="http://schemas.openxmlformats.org/markup-compatibility/2006" xmlns:aink="http://schemas.microsoft.com/office/drawing/2016/ink" xmlns:am3d="http://schemas.microsoft.com/office/drawing/2017/model3d" xmlns:o="urn:schemas-microsoft-com:office:office" xmlns:oel="http://schemas.microsoft.com/office/2019/extlst" xmlns:r="http://schemas.openxmlformats.org/officeDocument/2006/relationships" xmlns:m="http://schemas.openxmlformats.org/officeDocument/2006/math" xmlns:v="urn:schemas-microsoft-com:vml" xmlns:wp14="http://schemas.microsoft.com/office/word/2010/wordprocessingDrawing" xmlns:wp="http://schemas.openxmlformats.org/drawingml/2006/wordprocessingDrawing" xmlns:w10="urn:schemas-microsoft-com:office:word" xmlns:w="http://schemas.openxmlformats.org/wordprocessingml/2006/main" xmlns:w14="http://schemas.microsoft.com/office/word/2010/wordml" xmlns:w15="http://schemas.microsoft.com/office/word/2012/wordml" xmlns:w16cex="http://schemas.microsoft.com/office/word/2018/wordml/cex" xmlns:w16cid="http://schemas.microsoft.com/office/word/2016/wordml/cid" xmlns:w16="http://schemas.microsoft.com/office/word/2018/wordml" xmlns:w16du="http://schemas.microsoft.com/office/word/2023/wordml/word16du" xmlns:w16sdtdh="http://schemas.microsoft.com/office/word/2020/wordml/sdtdatahash" xmlns:w16sdtfl="http://schemas.microsoft.com/office/word/2024/wordml/sdtformatlock" xmlns:w16se="http://schemas.microsoft.com/office/word/2015/wordml/symex" xmlns:wpg="http://schemas.microsoft.com/office/word/2010/wordprocessingGroup" xmlns:wpi="http://schemas.microsoft.com/office/word/2010/wordprocessingInk" xmlns:wne="http://schemas.microsoft.com/office/word/2006/wordml" xmlns:wps="http://schemas.microsoft.com/office/word/2010/wordprocessingShape" mc:Ignorable="w14 w15 w16se w16cid w16 w16cex w16sdtdh w16sdtfl w16du wp14">
-  <w:p>
-    <w:pPr>
-      <w:pStyle w:val="Header"/>
-    </w:pPr>
-  </w:p>
-</w:hdr>
-</file>
-
 <file path=word/numbering.xml><?xml version="1.0" encoding="utf-8"?>
-<w:numbering xmlns:wpc="http://schemas.microsoft.com/office/word/2010/wordprocessingCanvas" xmlns:cx="http://schemas.microsoft.com/office/drawing/2014/chartex" xmlns:cx1="http://schemas.microsoft.com/office/drawing/2015/9/8/chartex" xmlns:cx2="http://schemas.microsoft.com/office/drawing/2015/10/21/chartex" xmlns:cx3="http://schemas.microsoft.com/office/drawing/2016/5/9/chartex" xmlns:cx4="http://schemas.microsoft.com/office/drawing/2016/5/10/chartex" xmlns:cx5="http://schemas.microsoft.com/office/drawing/2016/5/11/chartex" xmlns:cx6="http://schemas.microsoft.com/office/drawing/2016/5/12/chartex" xmlns:cx7="http://schemas.microsoft.com/office/drawing/2016/5/13/chartex" xmlns:cx8="http://schemas.microsoft.com/office/drawing/2016/5/14/chartex" xmlns:mc="http://schemas.openxmlformats.org/markup-compatibility/2006" xmlns:aink="http://schemas.microsoft.com/office/drawing/2016/ink" xmlns:am3d="http://schemas.microsoft.com/office/drawing/2017/model3d" xmlns:o="urn:schemas-microsoft-com:office:office" xmlns:oel="http://schemas.microsoft.com/office/2019/extlst" xmlns:r="http://schemas.openxmlformats.org/officeDocument/2006/relationships" xmlns:m="http://schemas.openxmlformats.org/officeDocument/2006/math" xmlns:v="urn:schemas-microsoft-com:vml" xmlns:wp14="http://schemas.microsoft.com/office/word/2010/wordprocessingDrawing" xmlns:wp="http://schemas.openxmlformats.org/drawingml/2006/wordprocessingDrawing" xmlns:w10="urn:schemas-microsoft-com:office:word" xmlns:w="http://schemas.openxmlformats.org/wordprocessingml/2006/main" xmlns:w14="http://schemas.microsoft.com/office/word/2010/wordml" xmlns:w15="http://schemas.microsoft.com/office/word/2012/wordml" xmlns:w16cex="http://schemas.microsoft.com/office/word/2018/wordml/cex" xmlns:w16cid="http://schemas.microsoft.com/office/word/2016/wordml/cid" xmlns:w16="http://schemas.microsoft.com/office/word/2018/wordml" xmlns:w16du="http://schemas.microsoft.com/office/word/2023/wordml/word16du" xmlns:w16sdtdh="http://schemas.microsoft.com/office/word/2020/wordml/sdtdatahash" xmlns:w16sdtfl="http://schemas.microsoft.com/office/word/2024/wordml/sdtformatlock" xmlns:w16se="http://schemas.microsoft.com/office/word/2015/wordml/symex" xmlns:wpg="http://schemas.microsoft.com/office/word/2010/wordprocessingGroup" xmlns:wpi="http://schemas.microsoft.com/office/word/2010/wordprocessingInk" xmlns:wne="http://schemas.microsoft.com/office/word/2006/wordml" xmlns:wps="http://schemas.microsoft.com/office/word/2010/wordprocessingShape" mc:Ignorable="w14 w15 w16se w16cid w16 w16cex w16sdtdh w16sdtfl w16du wp14">
+<w:numbering xmlns:wpc="http://schemas.microsoft.com/office/word/2010/wordprocessingCanvas" xmlns:cx="http://schemas.microsoft.com/office/drawing/2014/chartex" xmlns:cx1="http://schemas.microsoft.com/office/drawing/2015/9/8/chartex" xmlns:cx2="http://schemas.microsoft.com/office/drawing/2015/10/21/chartex" xmlns:cx3="http://schemas.microsoft.com/office/drawing/2016/5/9/chartex" xmlns:cx4="http://schemas.microsoft.com/office/drawing/2016/5/10/chartex" xmlns:cx5="http://schemas.microsoft.com/office/drawing/2016/5/11/chartex" xmlns:cx6="http://schemas.microsoft.com/office/drawing/2016/5/12/chartex" xmlns:cx7="http://schemas.microsoft.com/office/drawing/2016/5/13/chartex" xmlns:cx8="http://schemas.microsoft.com/office/drawing/2016/5/14/chartex" xmlns:mc="http://schemas.openxmlformats.org/markup-compatibility/2006" xmlns:aink="http://schemas.microsoft.com/office/drawing/2016/ink" xmlns:am3d="http://schemas.microsoft.com/office/drawing/2017/model3d" xmlns:o="urn:schemas-microsoft-com:office:office" xmlns:oel="http://schemas.microsoft.com/office/2019/extlst" xmlns:r="http://schemas.openxmlformats.org/officeDocument/2006/relationships" xmlns:m="http://schemas.openxmlformats.org/officeDocument/2006/math" xmlns:v="urn:schemas-microsoft-com:vml" xmlns:wp14="http://schemas.microsoft.com/office/word/2010/wordprocessingDrawing" xmlns:wp="http://schemas.openxmlformats.org/drawingml/2006/wordprocessingDrawing" xmlns:w10="urn:schemas-microsoft-com:office:word" xmlns:w="http://schemas.openxmlformats.org/wordprocessingml/2006/main" xmlns:w14="http://schemas.microsoft.com/office/word/2010/wordml" xmlns:w15="http://schemas.microsoft.com/office/word/2012/wordml" xmlns:w16cei="http://schemas.microsoft.com/office/word/2026/wordml/cei" xmlns:w16cex="http://schemas.microsoft.com/office/word/2018/wordml/cex" xmlns:w16cid="http://schemas.microsoft.com/office/word/2016/wordml/cid" xmlns:w16="http://schemas.microsoft.com/office/word/2018/wordml" xmlns:w16du="http://schemas.microsoft.com/office/word/2023/wordml/word16du" xmlns:w16sdtdh="http://schemas.microsoft.com/office/word/2020/wordml/sdtdatahash" xmlns:w16sdtfl="http://schemas.microsoft.com/office/word/2024/wordml/sdtformatlock" xmlns:w16se="http://schemas.microsoft.com/office/word/2015/wordml/symex" xmlns:wpg="http://schemas.microsoft.com/office/word/2010/wordprocessingGroup" xmlns:wpi="http://schemas.microsoft.com/office/word/2010/wordprocessingInk" xmlns:wne="http://schemas.microsoft.com/office/word/2006/wordml" xmlns:wps="http://schemas.microsoft.com/office/word/2010/wordprocessingShape" mc:Ignorable="w14 w15 w16se w16cid w16 w16cex w16sdtdh w16sdtfl w16du wp14">
   <w:abstractNum w:abstractNumId="0" w15:restartNumberingAfterBreak="0">
     <w:nsid w:val="024F3CBE"/>
     <w:multiLevelType w:val="hybridMultilevel"/>

</xml_diff>